<commit_message>
docs: reorganiza fase 01 e adiciona roteiro de discovery
</commit_message>
<xml_diff>
--- a/docs/00-processo/checklist-mestre-desenvolvimento-software.docx
+++ b/docs/00-processo/checklist-mestre-desenvolvimento-software.docx
@@ -213,163 +213,139 @@
         <w:rPr>
           <w:b w:val="0"/>
         </w:rPr>
-        <w:t>☐ Descrever o contexto do negócio</w:t>
-      </w:r>
-    </w:p>
-    <w:p>
-      <w:pPr>
-        <w:spacing w:after="40"/>
-        <w:ind w:left="0"/>
-      </w:pPr>
-      <w:r>
-        <w:rPr>
-          <w:b w:val="0"/>
-        </w:rPr>
-        <w:t>☐ Definir claramente o problema que será resolvido</w:t>
-      </w:r>
-    </w:p>
-    <w:p>
-      <w:pPr>
-        <w:spacing w:after="40"/>
-        <w:ind w:left="0"/>
-      </w:pPr>
-      <w:r>
-        <w:rPr>
-          <w:b w:val="0"/>
-        </w:rPr>
-        <w:t>☐ Registrar como o problema é tratado atualmente</w:t>
-      </w:r>
-    </w:p>
-    <w:p>
-      <w:pPr>
-        <w:spacing w:after="40"/>
-        <w:ind w:left="0"/>
-      </w:pPr>
-      <w:r>
-        <w:rPr>
-          <w:b w:val="0"/>
-        </w:rPr>
-        <w:t>☐ Identificar dores, desperdícios, riscos e limitações do processo atual</w:t>
-      </w:r>
-    </w:p>
-    <w:p>
-      <w:pPr>
-        <w:spacing w:after="40"/>
-        <w:ind w:left="0"/>
-      </w:pPr>
-      <w:r>
-        <w:rPr>
-          <w:b w:val="0"/>
-        </w:rPr>
-        <w:t>☐ Identificar usuários e demais partes interessadas</w:t>
-      </w:r>
-    </w:p>
-    <w:p>
-      <w:pPr>
-        <w:spacing w:after="40"/>
-        <w:ind w:left="0"/>
-      </w:pPr>
-      <w:r>
-        <w:rPr>
-          <w:b w:val="0"/>
-        </w:rPr>
-        <w:t>☐ Definir objetivo principal do sistema</w:t>
-      </w:r>
-    </w:p>
-    <w:p>
-      <w:pPr>
-        <w:spacing w:after="40"/>
-        <w:ind w:left="0"/>
-      </w:pPr>
-      <w:r>
-        <w:rPr>
-          <w:b w:val="0"/>
-        </w:rPr>
-        <w:t>☐ Definir objetivos secundários</w:t>
-      </w:r>
-    </w:p>
-    <w:p>
-      <w:pPr>
-        <w:spacing w:after="40"/>
-        <w:ind w:left="0"/>
-      </w:pPr>
-      <w:r>
-        <w:rPr>
-          <w:b w:val="0"/>
-        </w:rPr>
-        <w:t>☐ Definir resultados esperados</w:t>
-      </w:r>
-    </w:p>
-    <w:p>
-      <w:pPr>
-        <w:spacing w:after="40"/>
-        <w:ind w:left="0"/>
-      </w:pPr>
-      <w:r>
-        <w:rPr>
-          <w:b w:val="0"/>
-        </w:rPr>
-        <w:t>☐ Definir indicadores ou sinais que mostrarão que a solução gerou valor</w:t>
-      </w:r>
-    </w:p>
-    <w:p>
-      <w:pPr>
-        <w:spacing w:after="40"/>
-        <w:ind w:left="0"/>
-      </w:pPr>
-      <w:r>
-        <w:rPr>
-          <w:b w:val="0"/>
-        </w:rPr>
-        <w:t>☐ Registrar premissas do projeto</w:t>
-      </w:r>
-    </w:p>
-    <w:p>
-      <w:pPr>
-        <w:spacing w:after="40"/>
-        <w:ind w:left="0"/>
-      </w:pPr>
-      <w:r>
-        <w:rPr>
-          <w:b w:val="0"/>
-        </w:rPr>
-        <w:t>☐ Registrar restrições conhecidas</w:t>
-      </w:r>
-    </w:p>
-    <w:p>
-      <w:pPr>
-        <w:spacing w:after="40"/>
-        <w:ind w:left="0"/>
-      </w:pPr>
-      <w:r>
-        <w:rPr>
-          <w:b w:val="0"/>
-        </w:rPr>
-        <w:t>☐ Registrar o que não faz parte do objetivo atual</w:t>
-      </w:r>
-    </w:p>
-    <w:p>
-      <w:pPr>
-        <w:spacing w:after="40"/>
-        <w:ind w:left="0"/>
-      </w:pPr>
-      <w:r>
-        <w:rPr>
-          <w:b w:val="0"/>
-        </w:rPr>
-        <w:t>☐ Definir visão futura do produto sem incorporá-la automaticamente ao MVP</w:t>
-      </w:r>
-    </w:p>
-    <w:p>
-      <w:pPr>
-        <w:spacing w:after="40"/>
-        <w:ind w:left="0"/>
-      </w:pPr>
-      <w:r>
-        <w:rPr>
-          <w:b w:val="0"/>
-        </w:rPr>
-        <w:t>☐ Revisar e aprovar a visão com informação suficiente para orientar o próximo incremento</w:t>
+        <w:t>☐ Descrever o negócio e a atividade em que o problema ocorre, delimitando o contexto da descoberta</w:t>
+      </w:r>
+    </w:p>
+    <w:p>
+      <w:pPr>
+        <w:spacing w:after="40"/>
+        <w:ind w:left="0"/>
+      </w:pPr>
+      <w:r>
+        <w:rPr>
+          <w:b w:val="0"/>
+        </w:rPr>
+        <w:t>☐ Registrar os problemas relatados com exemplos concretos, fonte da informação e frequência conhecida</w:t>
+      </w:r>
+    </w:p>
+    <w:p>
+      <w:pPr>
+        <w:spacing w:after="40"/>
+        <w:ind w:left="0"/>
+      </w:pPr>
+      <w:r>
+        <w:rPr>
+          <w:b w:val="0"/>
+        </w:rPr>
+        <w:t>☐ Descrever as consequências observadas, incluindo perdas, retrabalho e limitações quando existirem; distinguir riscos potenciais de impactos já ocorridos</w:t>
+      </w:r>
+    </w:p>
+    <w:p>
+      <w:pPr>
+        <w:spacing w:after="40"/>
+        <w:ind w:left="0"/>
+      </w:pPr>
+      <w:r>
+        <w:rPr>
+          <w:b w:val="0"/>
+        </w:rPr>
+        <w:t>☐ Resumir como a atividade é realizada e como o problema é tratado hoje, incluindo tentativas anteriores e limitações que permanecem</w:t>
+      </w:r>
+    </w:p>
+    <w:p>
+      <w:pPr>
+        <w:spacing w:after="40"/>
+        <w:ind w:left="0"/>
+      </w:pPr>
+      <w:r>
+        <w:rPr>
+          <w:b w:val="0"/>
+        </w:rPr>
+        <w:t>☐ Identificar quem realiza a atividade, quem poderá usar a solução e quem participa das decisões ou precisa ser ouvido</w:t>
+      </w:r>
+    </w:p>
+    <w:p>
+      <w:pPr>
+        <w:spacing w:after="40"/>
+        <w:ind w:left="0"/>
+      </w:pPr>
+      <w:r>
+        <w:rPr>
+          <w:b w:val="0"/>
+        </w:rPr>
+        <w:t>☐ Selecionar o problema prioritário e registrar a justificativa dessa prioridade</w:t>
+      </w:r>
+    </w:p>
+    <w:p>
+      <w:pPr>
+        <w:spacing w:after="40"/>
+        <w:ind w:left="0"/>
+      </w:pPr>
+      <w:r>
+        <w:rPr>
+          <w:b w:val="0"/>
+        </w:rPr>
+        <w:t>☐ Definir o objetivo principal como a melhoria desejada e registrar objetivos secundários somente quando houver necessidades distintas</w:t>
+      </w:r>
+    </w:p>
+    <w:p>
+      <w:pPr>
+        <w:spacing w:after="40"/>
+        <w:ind w:left="0"/>
+      </w:pPr>
+      <w:r>
+        <w:rPr>
+          <w:b w:val="0"/>
+        </w:rPr>
+        <w:t>☐ Definir como verificar o resultado: situação atual, melhoria esperada, indicador ou sinal observável, momento de avaliação e responsável; registrar o que ainda precisa ser confirmado</w:t>
+      </w:r>
+    </w:p>
+    <w:p>
+      <w:pPr>
+        <w:spacing w:after="40"/>
+        <w:ind w:left="0"/>
+      </w:pPr>
+      <w:r>
+        <w:rPr>
+          <w:b w:val="0"/>
+        </w:rPr>
+        <w:t>☐ Revisar as premissas e restrições do contexto inicial à luz da descoberta, registrando mudanças e hipóteses ainda não confirmadas</w:t>
+      </w:r>
+    </w:p>
+    <w:p>
+      <w:pPr>
+        <w:spacing w:after="40"/>
+        <w:ind w:left="0"/>
+      </w:pPr>
+      <w:r>
+        <w:rPr>
+          <w:b w:val="0"/>
+        </w:rPr>
+        <w:t>☐ Delimitar o que será tratado agora e o que ficará fora, mantendo eventuais ideias futuras separadas e sem compromisso automático de inclusão no MVP</w:t>
+      </w:r>
+    </w:p>
+    <w:p>
+      <w:pPr>
+        <w:spacing w:after="40"/>
+        <w:ind w:left="0"/>
+      </w:pPr>
+      <w:r>
+        <w:rPr>
+          <w:b w:val="0"/>
+        </w:rPr>
+        <w:t>☐ Registrar pendências que afetem a visão, quem poderá esclarecê-las e quando serão retomadas</w:t>
+      </w:r>
+    </w:p>
+    <w:p>
+      <w:pPr>
+        <w:spacing w:after="40"/>
+        <w:ind w:left="0"/>
+      </w:pPr>
+      <w:r>
+        <w:rPr>
+          <w:b w:val="0"/>
+        </w:rPr>
+        <w:t>☐ Consolidar e validar a visão com as pessoas relevantes, com entendimento suficiente para orientar o próximo incremento e pendências explicitadas</w:t>
       </w:r>
     </w:p>
     <w:p>
@@ -382,7 +358,7 @@
           <w:i/>
           <w:sz w:val="18"/>
         </w:rPr>
-        <w:t>Artefato/saída: Documento de Visão do Projeto.</w:t>
+        <w:t>Artefato/saída: Documento de Visão do Projeto, com referência aos registros da descoberta e às pendências.</w:t>
       </w:r>
     </w:p>
     <w:p>

</xml_diff>